<commit_message>
Taller 2: documento y zip según la estructura de entrega
Co-Authored-By: Claude Opus 5.5 <noreply@anthropic.com>
</commit_message>
<xml_diff>
--- a/taller-02/alex_nail/documento-entrega.docx
+++ b/taller-02/alex_nail/documento-entrega.docx
@@ -81,18 +81,6 @@
       </w:pPr>
       <w:r>
         <w:rPr>
-          <w:b/>
-          <w:sz w:val="24"/>
-        </w:rPr>
-        <w:t>Esta versión: Alex Nail</w:t>
-      </w:r>
-    </w:p>
-    <w:p>
-      <w:pPr>
-        <w:jc w:val="center"/>
-      </w:pPr>
-      <w:r>
-        <w:rPr>
           <w:b w:val="0"/>
           <w:sz w:val="20"/>
         </w:rPr>
@@ -262,10 +250,10 @@
         <w:rPr>
           <w:b/>
         </w:rPr>
-        <w:t xml:space="preserve">Lo que pide el taller: </w:t>
-      </w:r>
-      <w:r>
-        <w:t>construir el agente RAG con el ayudante de programación, ingestar el PDF y hacer la primera pregunta mostrando la ruta del grafo (--saltos).</w:t>
+        <w:t xml:space="preserve">Qué entregas (pauta): </w:t>
+      </w:r>
+      <w:r>
+        <w:t>Captura del agente respondiendo; prompts usados con OpenCode y qué corregiste.</w:t>
       </w:r>
     </w:p>
     <w:p>
@@ -628,10 +616,10 @@
         <w:rPr>
           <w:b/>
         </w:rPr>
-        <w:t xml:space="preserve">Lo que pide el taller: </w:t>
-      </w:r>
-      <w:r>
-        <w:t>comprobar que los embeddings miden significado (predecir antes de medir con frases propias, prueba del banco) y comparar índice vectorial con coseno a mano.</w:t>
+        <w:t xml:space="preserve">Qué entregas (pauta): </w:t>
+      </w:r>
+      <w:r>
+        <w:t>Tus tres frases, tu predicción, la tabla de cosenos y la conclusión.</w:t>
       </w:r>
     </w:p>
     <w:p>
@@ -1541,10 +1529,10 @@
         <w:rPr>
           <w:b/>
         </w:rPr>
-        <w:t xml:space="preserve">Lo que pide el taller: </w:t>
-      </w:r>
-      <w:r>
-        <w:t>probar tres configuraciones de chunk y solape, mirar el solape real y hacer la misma pregunta con cada una para elegir.</w:t>
+        <w:t xml:space="preserve">Qué entregas (pauta): </w:t>
+      </w:r>
+      <w:r>
+        <w:t>Tabla de dos configuraciones de chunk/solape, la elegida y por qué.</w:t>
       </w:r>
     </w:p>
     <w:p>
@@ -3155,10 +3143,10 @@
         <w:rPr>
           <w:b/>
         </w:rPr>
-        <w:t xml:space="preserve">Lo que pide el taller: </w:t>
-      </w:r>
-      <w:r>
-        <w:t>correr preguntas dentro, fuera y ambiguas, medir falsos positivos y negativos, y elegir UMBRAL y TOP_K con datos.</w:t>
+        <w:t xml:space="preserve">Qué entregas (pauta): </w:t>
+      </w:r>
+      <w:r>
+        <w:t>Tabla de diez preguntas con ruta, parecido, respuesta y cita; UMBRAL y TOP_K elegidos con datos.</w:t>
       </w:r>
     </w:p>
     <w:p>
@@ -7197,10 +7185,10 @@
         <w:rPr>
           <w:b/>
         </w:rPr>
-        <w:t xml:space="preserve">Lo que pide el taller: </w:t>
-      </w:r>
-      <w:r>
-        <w:t>cambiar dos reglas del prompt del agente, comparar antes y después, probar una pregunta trampa y una prueba sin la regla de responder solo con el contexto.</w:t>
+        <w:t xml:space="preserve">Qué entregas (pauta): </w:t>
+      </w:r>
+      <w:r>
+        <w:t>Dos reglas cambiadas con antes/después en tres preguntas; prueba de la trampa; prompts.py final.</w:t>
       </w:r>
     </w:p>
     <w:p>
@@ -8421,10 +8409,10 @@
         <w:rPr>
           <w:b/>
         </w:rPr>
-        <w:t xml:space="preserve">Lo que pide el taller: </w:t>
-      </w:r>
-      <w:r>
-        <w:t>agregar un nodo al grafo, justificarlo y medir si mejora sin romper lo que ya funcionaba.</w:t>
+        <w:t xml:space="preserve">Qué entregas (pauta): </w:t>
+      </w:r>
+      <w:r>
+        <w:t>Definición del nodo (por qué, para qué, qué hace), ruta con --saltos antes y después, dos preguntas donde mejora.</w:t>
       </w:r>
     </w:p>
     <w:p>
@@ -10382,7 +10370,7 @@
     </w:p>
     <w:p>
       <w:r>
-        <w:t>¿Mejoró? Mejoró en dos de tres: la pregunta coloquial (+0,024) y la S de la batería (+0,025, siguió citando la p. 6). No mejoró en la principal: No en lo principal. La pregunta 1 pasó de 0,699 a 0,700: la bibliografía bajó de 2 a 1 fragmento, pero el resumen (p. 1) salió del top-3. Creo que es porque "¿De qué trata el documento?" pregunta por el documento mismo, y el texto nunca habla de sí mismo con esas palabras. La pregunta 2 mejoró un poco (+0,024). Costos: la F subió de 0,648 a 0,652 (con el umbral anterior de 0,65 habría sido un falso positivo) y cada pregunta gasta una llamada más al modelo. Lo siguiente que probaría: que reformular cambie "el documento" por "el objetivo del trabajo".</w:t>
+        <w:t>¿Mejoró? Mejoró en dos de tres: la pregunta coloquial (+0,024) y la S de la batería (+0,025, siguió citando la p. 6). No mejoró en la principal: La pregunta 1 pasó de 0,699 a 0,700: la bibliografía bajó de 2 a 1 fragmento, pero el resumen (p. 1) salió del top-3. Creo que es porque "¿De qué trata el documento?" pregunta por el documento mismo, y el texto nunca habla de sí mismo con esas palabras. La pregunta 2 mejoró un poco (+0,024). Costos: la F subió de 0,648 a 0,652 (con el umbral anterior de 0,65 habría sido un falso positivo) y cada pregunta gasta una llamada más al modelo. Lo siguiente que probaría: que reformular cambie "el documento" por "el objetivo del trabajo".</w:t>
       </w:r>
     </w:p>
     <w:p>
@@ -10795,10 +10783,10 @@
         <w:rPr>
           <w:b/>
         </w:rPr>
-        <w:t xml:space="preserve">Lo que pide el taller: </w:t>
-      </w:r>
-      <w:r>
-        <w:t>correr la misma batería en FAISS y comparar con Redis en resultados y tiempos.</w:t>
+        <w:t xml:space="preserve">Qué entregas (pauta): </w:t>
+      </w:r>
+      <w:r>
+        <w:t>La misma batería con VECTOR_STORE=faiss y comparación con Redis.</w:t>
       </w:r>
     </w:p>
     <w:p>

</xml_diff>